<commit_message>
nyeb adversary-complaint: typst and docx on the shared cross-engine layout model; docx/build-reference.sh, pkg.pl and reference.docx give way to docx/reference.xml (base="xengine", {font} Times New Roman, was EB Garamond; letter page, LBR 9004-1(a)(ii), 1 in margins) and a filter on require("docx.xengine"); body 24 pt and single 13.8 pt line boxes (480/276 twips), 12 pt above a heading, explicit caption, court-title and signature spaces in both engines; the caption a ruled two-row table (rules taken off the cell padding), numbers column centred on the parties; lead-in with a first-line indent (was indented whole); only the last prayer item kept with the signature (was the whole prayer); the signature's underscore rule typed as written in both engines ($FORMBOOK_META; typst read it as a thematic break); docx XENG-001..003 pass (9/9 pages, 237/237 lines), params.cross_engine: gate; typst 9 / docx 13 checks passed, 0 failed (fb-595.68.25)
</commit_message>
<xml_diff>
--- a/courts/second-circuit/new-york/federal/bankruptcy-eastern-district/adversary-complaint/usage/OUTPUT-adversary-complaint.docx
+++ b/courts/second-circuit/new-york/federal/bankruptcy-eastern-district/adversary-complaint/usage/OUTPUT-adversary-complaint.docx
@@ -4,8 +4,9 @@
   <w:body>
     <w:p>
       <w:pPr>
-        <w:pStyle w:val="Centered"/>
-        <w:spacing w:before="0" w:after="120"/>
+        <w:spacing w:before="0" w:after="0" w:line="276" w:lineRule="exact"/>
+        <w:ind w:left="0" w:firstLine="0"/>
+        <w:jc w:val="center"/>
       </w:pPr>
       <w:r>
         <w:rPr>
@@ -17,8 +18,9 @@
     </w:p>
     <w:p>
       <w:pPr>
-        <w:pStyle w:val="Centered"/>
-        <w:spacing w:before="0" w:after="360"/>
+        <w:spacing w:before="120" w:after="0" w:line="276" w:lineRule="exact"/>
+        <w:ind w:left="0" w:firstLine="0"/>
+        <w:jc w:val="center"/>
       </w:pPr>
       <w:r>
         <w:rPr>
@@ -27,6 +29,11 @@
         </w:rPr>
         <w:t xml:space="preserve">EASTERN DISTRICT OF NEW YORK</w:t>
       </w:r>
+    </w:p>
+    <w:p>
+      <w:pPr>
+        <w:spacing w:before="0" w:after="0" w:line="480" w:lineRule="exact"/>
+      </w:pPr>
     </w:p>
     <w:tbl>
       <w:tblPr>
@@ -49,7 +56,8 @@
       </w:tblPr>
       <w:tblGrid>
         <w:gridCol w:w="5472"/>
-        <w:gridCol w:w="3888"/>
+        <w:gridCol w:w="288"/>
+        <w:gridCol w:w="3600"/>
       </w:tblGrid>
       <w:tr>
         <w:trPr>
@@ -63,16 +71,18 @@
               <w:bottom w:val="single" w:sz="6" w:space="0" w:color="000000"/>
             </w:tcBorders>
             <w:tcMar>
-              <w:top w:w="160" w:type="dxa"/>
+              <w:top w:w="145" w:type="dxa"/>
               <w:left w:w="0" w:type="dxa"/>
-              <w:bottom w:w="160" w:type="dxa"/>
+              <w:bottom w:w="145" w:type="dxa"/>
               <w:right w:w="0" w:type="dxa"/>
             </w:tcMar>
             <w:vAlign w:val="top"/>
           </w:tcPr>
           <w:p>
             <w:pPr>
-              <w:pStyle w:val="Single"/>
+              <w:spacing w:before="0" w:after="0" w:line="276" w:lineRule="exact"/>
+              <w:ind w:left="0" w:firstLine="0"/>
+              <w:jc w:val="left"/>
             </w:pPr>
             <w:r>
               <w:t xml:space="preserve">In re:</w:t>
@@ -80,16 +90,25 @@
           </w:p>
           <w:p>
             <w:pPr>
-              <w:pStyle w:val="Single"/>
+              <w:spacing w:before="0" w:after="0" w:line="276" w:lineRule="exact"/>
+              <w:ind w:left="0" w:firstLine="0"/>
+              <w:jc w:val="left"/>
             </w:pPr>
             <w:r>
-              <w:t xml:space="preserve">TOYVATION, LLC</w:t>
+              <w:t xml:space="preserve">TOYVATION,</w:t>
+            </w:r>
+            <w:r>
+              <w:t xml:space="preserve"> </w:t>
+            </w:r>
+            <w:r>
+              <w:t xml:space="preserve">LLC</w:t>
             </w:r>
           </w:p>
           <w:p>
             <w:pPr>
-              <w:pStyle w:val="Single"/>
+              <w:spacing w:before="0" w:after="0" w:line="276" w:lineRule="exact"/>
               <w:ind w:left="1728" w:firstLine="0"/>
+              <w:jc w:val="left"/>
             </w:pPr>
             <w:r>
               <w:t xml:space="preserve">Debtor.</w:t>
@@ -98,30 +117,59 @@
         </w:tc>
         <w:tc>
           <w:tcPr>
-            <w:tcW w:w="3888" w:type="dxa"/>
+            <w:tcW w:w="288" w:type="dxa"/>
             <w:tcBorders>
               <w:top w:val="single" w:sz="6" w:space="0" w:color="000000"/>
               <w:bottom w:val="single" w:sz="6" w:space="0" w:color="000000"/>
             </w:tcBorders>
             <w:tcMar>
-              <w:top w:w="160" w:type="dxa"/>
-              <w:left w:w="288" w:type="dxa"/>
-              <w:bottom w:w="160" w:type="dxa"/>
+              <w:top w:w="145" w:type="dxa"/>
+              <w:left w:w="0" w:type="dxa"/>
+              <w:bottom w:w="145" w:type="dxa"/>
+              <w:right w:w="0" w:type="dxa"/>
+            </w:tcMar>
+            <w:vAlign w:val="top"/>
+          </w:tcPr>
+          <w:p>
+            <w:pPr>
+              <w:spacing w:before="0" w:after="0" w:line="276" w:lineRule="exact"/>
+              <w:ind w:left="0" w:firstLine="0"/>
+              <w:jc w:val="left"/>
+            </w:pPr>
+          </w:p>
+        </w:tc>
+        <w:tc>
+          <w:tcPr>
+            <w:tcW w:w="3600" w:type="dxa"/>
+            <w:tcBorders>
+              <w:top w:val="single" w:sz="6" w:space="0" w:color="000000"/>
+              <w:bottom w:val="single" w:sz="6" w:space="0" w:color="000000"/>
+            </w:tcBorders>
+            <w:tcMar>
+              <w:top w:w="145" w:type="dxa"/>
+              <w:left w:w="0" w:type="dxa"/>
+              <w:bottom w:w="145" w:type="dxa"/>
               <w:right w:w="0" w:type="dxa"/>
             </w:tcMar>
             <w:vAlign w:val="center"/>
           </w:tcPr>
           <w:p>
             <w:pPr>
-              <w:pStyle w:val="Single"/>
+              <w:spacing w:before="0" w:after="0" w:line="276" w:lineRule="exact"/>
+              <w:ind w:left="0" w:firstLine="0"/>
+              <w:jc w:val="left"/>
             </w:pPr>
             <w:r>
-              <w:t xml:space="preserve">Case No. 26-43344-ess</w:t>
+              <w:t xml:space="preserve">Case No. 26</w:t>
+              <w:noBreakHyphen/>
+              <w:t xml:space="preserve">43344-ess</w:t>
             </w:r>
           </w:p>
           <w:p>
             <w:pPr>
-              <w:pStyle w:val="Single"/>
+              <w:spacing w:before="0" w:after="0" w:line="276" w:lineRule="exact"/>
+              <w:ind w:left="0" w:firstLine="0"/>
+              <w:jc w:val="left"/>
             </w:pPr>
             <w:r>
               <w:t xml:space="preserve">Chapter 11</w:t>
@@ -140,25 +188,34 @@
               <w:bottom w:val="single" w:sz="6" w:space="0" w:color="000000"/>
             </w:tcBorders>
             <w:tcMar>
-              <w:top w:w="40" w:type="dxa"/>
+              <w:top w:w="160" w:type="dxa"/>
               <w:left w:w="0" w:type="dxa"/>
-              <w:bottom w:w="160" w:type="dxa"/>
+              <w:bottom w:w="145" w:type="dxa"/>
               <w:right w:w="0" w:type="dxa"/>
             </w:tcMar>
             <w:vAlign w:val="top"/>
           </w:tcPr>
           <w:p>
             <w:pPr>
-              <w:pStyle w:val="Single"/>
+              <w:spacing w:before="0" w:after="0" w:line="276" w:lineRule="exact"/>
+              <w:ind w:left="0" w:firstLine="0"/>
+              <w:jc w:val="left"/>
             </w:pPr>
             <w:r>
-              <w:t xml:space="preserve">TOYVATION, LLC,</w:t>
+              <w:t xml:space="preserve">TOYVATION,</w:t>
+            </w:r>
+            <w:r>
+              <w:t xml:space="preserve"> </w:t>
+            </w:r>
+            <w:r>
+              <w:t xml:space="preserve">LLC,</w:t>
             </w:r>
           </w:p>
           <w:p>
             <w:pPr>
-              <w:pStyle w:val="Single"/>
+              <w:spacing w:before="0" w:after="0" w:line="276" w:lineRule="exact"/>
               <w:ind w:left="1728" w:firstLine="0"/>
+              <w:jc w:val="left"/>
             </w:pPr>
             <w:r>
               <w:t xml:space="preserve">Plaintiff</w:t>
@@ -166,8 +223,9 @@
           </w:p>
           <w:p>
             <w:pPr>
-              <w:pStyle w:val="Centered"/>
-              <w:spacing w:before="120" w:after="120"/>
+              <w:spacing w:before="240" w:after="240" w:line="276" w:lineRule="exact"/>
+              <w:ind w:left="0" w:firstLine="0"/>
+              <w:jc w:val="center"/>
             </w:pPr>
             <w:r>
               <w:t xml:space="preserve">-against-</w:t>
@@ -175,16 +233,133 @@
           </w:p>
           <w:p>
             <w:pPr>
-              <w:pStyle w:val="Single"/>
+              <w:spacing w:before="0" w:after="0" w:line="276" w:lineRule="exact"/>
+              <w:ind w:left="0" w:firstLine="0"/>
+              <w:jc w:val="left"/>
             </w:pPr>
             <w:r>
-              <w:t xml:space="preserve">ABRAHAM ROTH, ROTH &amp; COMPANY LLP, d/b/a ROTH &amp; CO., SHULEM ROSENBAUM a/k/a SHULIM ROSENBAUM, DOVY GARTENHAUS and LEAH LIEBER,</w:t>
+              <w:t xml:space="preserve">ABRAHAM</w:t>
+            </w:r>
+            <w:r>
+              <w:t xml:space="preserve"> </w:t>
+            </w:r>
+            <w:r>
+              <w:t xml:space="preserve">ROTH,</w:t>
+            </w:r>
+            <w:r>
+              <w:t xml:space="preserve"> </w:t>
+            </w:r>
+            <w:r>
+              <w:t xml:space="preserve">ROTH</w:t>
+            </w:r>
+            <w:r>
+              <w:t xml:space="preserve"> </w:t>
+            </w:r>
+            <w:r>
+              <w:t xml:space="preserve">&amp;</w:t>
+            </w:r>
+            <w:r>
+              <w:t xml:space="preserve"> </w:t>
+            </w:r>
+            <w:r>
+              <w:t xml:space="preserve">COMPANY</w:t>
+            </w:r>
+            <w:r>
+              <w:t xml:space="preserve"> </w:t>
+            </w:r>
+            <w:r>
+              <w:t xml:space="preserve">LLP,</w:t>
+            </w:r>
+            <w:r>
+              <w:t xml:space="preserve"> </w:t>
+            </w:r>
+            <w:r>
+              <w:t xml:space="preserve">d/​b/​a</w:t>
+            </w:r>
+            <w:r>
+              <w:t xml:space="preserve"> </w:t>
+            </w:r>
+            <w:r>
+              <w:t xml:space="preserve">ROTH</w:t>
+            </w:r>
+            <w:r>
+              <w:t xml:space="preserve"> </w:t>
+            </w:r>
+            <w:r>
+              <w:t xml:space="preserve">&amp;</w:t>
+            </w:r>
+            <w:r>
+              <w:t xml:space="preserve"> </w:t>
+            </w:r>
+            <w:r>
+              <w:t xml:space="preserve">CO.,</w:t>
+            </w:r>
+            <w:r>
+              <w:t xml:space="preserve"> </w:t>
+            </w:r>
+            <w:r>
+              <w:t xml:space="preserve">SHULEM</w:t>
+            </w:r>
+            <w:r>
+              <w:t xml:space="preserve"> </w:t>
+            </w:r>
+            <w:r>
+              <w:t xml:space="preserve">ROSENBAUM</w:t>
+            </w:r>
+            <w:r>
+              <w:t xml:space="preserve"> </w:t>
+            </w:r>
+            <w:r>
+              <w:t xml:space="preserve">a/​k/​a</w:t>
+            </w:r>
+            <w:r>
+              <w:t xml:space="preserve"> </w:t>
+            </w:r>
+            <w:r>
+              <w:t xml:space="preserve">SHULIM</w:t>
+            </w:r>
+            <w:r>
+              <w:t xml:space="preserve"> </w:t>
+            </w:r>
+            <w:r>
+              <w:t xml:space="preserve">ROSENBAUM,</w:t>
+            </w:r>
+            <w:r>
+              <w:t xml:space="preserve"> </w:t>
+            </w:r>
+            <w:r>
+              <w:t xml:space="preserve">DOVY</w:t>
+            </w:r>
+            <w:r>
+              <w:t xml:space="preserve"> </w:t>
+            </w:r>
+            <w:r>
+              <w:t xml:space="preserve">GARTENHAUS</w:t>
+            </w:r>
+            <w:r>
+              <w:t xml:space="preserve"> </w:t>
+            </w:r>
+            <w:r>
+              <w:t xml:space="preserve">and</w:t>
+            </w:r>
+            <w:r>
+              <w:t xml:space="preserve"> </w:t>
+            </w:r>
+            <w:r>
+              <w:t xml:space="preserve">LEAH</w:t>
+            </w:r>
+            <w:r>
+              <w:t xml:space="preserve"> </w:t>
+            </w:r>
+            <w:r>
+              <w:t xml:space="preserve">LIEBER,</w:t>
             </w:r>
           </w:p>
           <w:p>
             <w:pPr>
-              <w:pStyle w:val="Single"/>
+              <w:spacing w:before="0" w:after="0" w:line="276" w:lineRule="exact"/>
               <w:ind w:left="1728" w:firstLine="0"/>
+              <w:jc w:val="left"/>
             </w:pPr>
             <w:r>
               <w:t xml:space="preserve">Defendants.</w:t>
@@ -193,34 +368,64 @@
         </w:tc>
         <w:tc>
           <w:tcPr>
-            <w:tcW w:w="3888" w:type="dxa"/>
+            <w:tcW w:w="288" w:type="dxa"/>
             <w:tcBorders>
               <w:bottom w:val="single" w:sz="6" w:space="0" w:color="000000"/>
             </w:tcBorders>
             <w:tcMar>
-              <w:top w:w="40" w:type="dxa"/>
-              <w:left w:w="288" w:type="dxa"/>
-              <w:bottom w:w="160" w:type="dxa"/>
+              <w:top w:w="160" w:type="dxa"/>
+              <w:left w:w="0" w:type="dxa"/>
+              <w:bottom w:w="145" w:type="dxa"/>
+              <w:right w:w="0" w:type="dxa"/>
+            </w:tcMar>
+            <w:vAlign w:val="top"/>
+          </w:tcPr>
+          <w:p>
+            <w:pPr>
+              <w:spacing w:before="0" w:after="0" w:line="276" w:lineRule="exact"/>
+              <w:ind w:left="0" w:firstLine="0"/>
+              <w:jc w:val="left"/>
+            </w:pPr>
+          </w:p>
+        </w:tc>
+        <w:tc>
+          <w:tcPr>
+            <w:tcW w:w="3600" w:type="dxa"/>
+            <w:tcBorders>
+              <w:bottom w:val="single" w:sz="6" w:space="0" w:color="000000"/>
+            </w:tcBorders>
+            <w:tcMar>
+              <w:top w:w="160" w:type="dxa"/>
+              <w:left w:w="0" w:type="dxa"/>
+              <w:bottom w:w="145" w:type="dxa"/>
               <w:right w:w="0" w:type="dxa"/>
             </w:tcMar>
             <w:vAlign w:val="center"/>
           </w:tcPr>
           <w:p>
             <w:pPr>
-              <w:pStyle w:val="Single"/>
+              <w:spacing w:before="0" w:after="0" w:line="276" w:lineRule="exact"/>
+              <w:ind w:left="0" w:firstLine="0"/>
+              <w:jc w:val="left"/>
             </w:pPr>
             <w:r>
-              <w:t xml:space="preserve">Adv. Pro. No. 26-01152-ess</w:t>
+              <w:t xml:space="preserve">Adv. Pro. No. 26</w:t>
+              <w:noBreakHyphen/>
+              <w:t xml:space="preserve">01152-ess</w:t>
             </w:r>
           </w:p>
           <w:p>
             <w:pPr>
-              <w:pStyle w:val="Gap6"/>
+              <w:spacing w:before="0" w:after="0" w:line="276" w:lineRule="exact"/>
+              <w:ind w:left="0" w:firstLine="0"/>
+              <w:jc w:val="left"/>
             </w:pPr>
           </w:p>
           <w:p>
             <w:pPr>
-              <w:pStyle w:val="Single"/>
+              <w:spacing w:before="0" w:after="0" w:line="276" w:lineRule="exact"/>
+              <w:ind w:left="0" w:firstLine="0"/>
+              <w:jc w:val="left"/>
             </w:pPr>
             <w:r>
               <w:rPr>
@@ -235,26 +440,24 @@
     </w:tbl>
     <w:p>
       <w:pPr>
-        <w:pStyle w:val="Spacer"/>
-      </w:pPr>
-    </w:p>
-    <w:p>
-      <w:pPr>
-        <w:pStyle w:val="Lead"/>
-      </w:pPr>
-      <w:r>
-        <w:t xml:space="preserve">Plaintiff Toyvation, LLC, by its attorney, for its Complaint against Defendants Abraham Roth, Roth &amp; Company LLP d/b/a Roth &amp; Co., Shulem Rosenbaum and Dovy Gartenhaus and Leah Lieber, allege as follows:</w:t>
+        <w:spacing w:before="0" w:after="0" w:line="480" w:lineRule="exact"/>
+      </w:pPr>
+    </w:p>
+    <w:p>
+      <w:pPr>
+        <w:pStyle w:val="BodyText"/>
+      </w:pPr>
+      <w:r>
+        <w:t xml:space="preserve">Plaintiff Toyvation, LLC, by its attorney, for its Complaint against Defendants Abraham Roth, Roth &amp; Company LLP d/​b/​a Roth &amp; Co., Shulem Rosenbaum and Dovy Gartenhaus and Leah Lieber, allege as follows:</w:t>
       </w:r>
     </w:p>
     <w:p>
       <w:pPr>
         <w:pStyle w:val="Heading1"/>
       </w:pPr>
-      <w:bookmarkStart w:id="9" w:name="_0e2df9c0fe52ebd43073ce38f4076c822df9b17"/>
       <w:r>
         <w:t xml:space="preserve">JURISDICTION AND VENUE</w:t>
       </w:r>
-      <w:bookmarkEnd w:id="9"/>
     </w:p>
     <w:p>
       <w:pPr>
@@ -267,7 +470,7 @@
         <w:tab/>
       </w:r>
       <w:r>
-        <w:t xml:space="preserve">This Court has jurisdiction over the subject matter pursuant to 28 U.S.C. § 1334 and 28 U.S.C. § 157.</w:t>
+        <w:t xml:space="preserve">This Court has jurisdiction over the subject matter pursuant to 28 U.S.C. § 1334 and 28 U.S.C. § 157.</w:t>
       </w:r>
     </w:p>
     <w:p>
@@ -281,7 +484,7 @@
         <w:tab/>
       </w:r>
       <w:r>
-        <w:t xml:space="preserve">This is a core proceeding over which this Court has jurisdiction pursuant to 28 U.S.C. §§ 157(b)(2)(A), (E), (H), (K) and (0).</w:t>
+        <w:t xml:space="preserve">This is a core proceeding over which this Court has jurisdiction pursuant to 28 U.S.C. §§ 157(b)⁠(2)⁠(A), (E), (H), (K) and (0).</w:t>
       </w:r>
     </w:p>
     <w:p>
@@ -295,7 +498,7 @@
         <w:tab/>
       </w:r>
       <w:r>
-        <w:t xml:space="preserve">Venue is proper in this core proceeding pursuant to 28 U.S.C. § 1409.</w:t>
+        <w:t xml:space="preserve">Venue is proper in this core proceeding pursuant to 28 U.S.C. § 1409.</w:t>
       </w:r>
     </w:p>
     <w:p>
@@ -316,11 +519,9 @@
       <w:pPr>
         <w:pStyle w:val="Heading1"/>
       </w:pPr>
-      <w:bookmarkStart w:id="10" w:name="_4770b4048acc36d28fdceb11378756a321140bf"/>
       <w:r>
         <w:t xml:space="preserve">FIRST CAUSE OF ACTION AGAINST DEFENDANTS ROTH &amp; COMPANY LLP, ROSENBAUM and GARTENHAUS</w:t>
       </w:r>
-      <w:bookmarkEnd w:id="10"/>
     </w:p>
     <w:p>
       <w:pPr>
@@ -381,7 +582,7 @@
         <w:tab/>
       </w:r>
       <w:r>
-        <w:t xml:space="preserve">Defendant Shulem Rosenbaum, a/k/a Shulim Rosenbaum, is a certified public accountant employed by Roth &amp; Company LLP, specializing in forensic accounting.</w:t>
+        <w:t xml:space="preserve">Defendant Shulem Rosenbaum, a/​k/​a Shulim Rosenbaum, is a certified public accountant employed by Roth &amp; Company LLP, specializing in forensic accounting.</w:t>
       </w:r>
     </w:p>
     <w:p>
@@ -521,7 +722,7 @@
         <w:tab/>
       </w:r>
       <w:r>
-        <w:t xml:space="preserve">Toyvation hired defendant Roth &amp; Co. to do an accounting.</w:t>
+        <w:t xml:space="preserve">Toyvation hired defendant Roth &amp; Co. to do an accounting.</w:t>
       </w:r>
     </w:p>
     <w:p>
@@ -535,7 +736,7 @@
         <w:tab/>
       </w:r>
       <w:r>
-        <w:t xml:space="preserve">The accounting Roth &amp; Co. was engaged to perform required it to establish, for each of the Companies including the Debtor, at the company level: the company’s assets; its liabilities; its obligations to third-party creditors, vendors and taxing authorities; its inventory; its equity and each member’s capital account; and its receivables from and payables to Landau, Schaya and the other Companies.</w:t>
+        <w:t xml:space="preserve">The accounting Roth &amp; Co. was engaged to perform required it to establish, for each of the Companies including the Debtor, at the company level: the company’s assets; its liabilities; its obligations to third-party creditors, vendors and taxing authorities; its inventory; its equity and each member’s capital account; and its receivables from and payables to Landau, Schaya and the other Companies.</w:t>
       </w:r>
     </w:p>
     <w:p>
@@ -549,7 +750,7 @@
         <w:tab/>
       </w:r>
       <w:r>
-        <w:t xml:space="preserve">Roth &amp; Co. did not establish the assets, liabilities or creditor obligations of the Debtor or of any other Company at the company level. Instead, as set forth below, it consolidated all of the Companies into a single reckoning between Landau and Schaya personally and disregarded the separate existence, assets and creditors of each company, including the Debtor.</w:t>
+        <w:t xml:space="preserve">Roth &amp; Co. did not establish the assets, liabilities or creditor obligations of the Debtor or of any other Company at the company level. Instead, as set forth below, it consolidated all of the Companies into a single reckoning between Landau and Schaya personally and disregarded the separate existence, assets and creditors of each company, including the Debtor.</w:t>
       </w:r>
     </w:p>
     <w:p>
@@ -563,7 +764,7 @@
         <w:tab/>
       </w:r>
       <w:r>
-        <w:t xml:space="preserve">The Debtor’s books and records, including its QuickBooks company file, are property of the Debtor’s estate under 11 U.S.C. § 541(a)(1). Roth &amp; Co., as the Debtor’s accountant, holds those records and the work product the Debtor paid for, and is required to turn them over under 11 U.S.C. § 542(e).</w:t>
+        <w:t xml:space="preserve">The Debtor’s books and records, including its QuickBooks company file, are property of the Debtor’s estate under 11 U.S.C. § 541(a)⁠(1). Roth &amp; Co., as the Debtor’s accountant, holds those records and the work product the Debtor paid for, and is required to turn them over under 11 U.S.C. § 542(e).</w:t>
       </w:r>
     </w:p>
     <w:p>
@@ -577,7 +778,7 @@
         <w:tab/>
       </w:r>
       <w:r>
-        <w:t xml:space="preserve">Roth &amp; Co. alleged that it had done the accounting requested by Debtor.</w:t>
+        <w:t xml:space="preserve">Roth &amp; Co. alleged that it had done the accounting requested by Debtor.</w:t>
       </w:r>
     </w:p>
     <w:p>
@@ -591,7 +792,7 @@
         <w:tab/>
       </w:r>
       <w:r>
-        <w:t xml:space="preserve">Debtor requested that Roth &amp; Co. provide documents to it showing the accounting that it had performed in connection with the arbitration proceeding before defendant Abraham Roth.</w:t>
+        <w:t xml:space="preserve">Debtor requested that Roth &amp; Co. provide documents to it showing the accounting that it had performed in connection with the arbitration proceeding before defendant Abraham Roth.</w:t>
       </w:r>
     </w:p>
     <w:p>
@@ -647,18 +848,16 @@
         <w:tab/>
       </w:r>
       <w:r>
-        <w:t xml:space="preserve">The accounting performed by defendant Roth &amp; Co. is necessary so as to enable the Debtor to prepare a Plan and Disclosure Statement in the bankruptcy proceeding.</w:t>
+        <w:t xml:space="preserve">The accounting performed by defendant Roth &amp; Co. is necessary so as to enable the Debtor to prepare a Plan and Disclosure Statement in the bankruptcy proceeding.</w:t>
       </w:r>
     </w:p>
     <w:p>
       <w:pPr>
         <w:pStyle w:val="Heading1"/>
       </w:pPr>
-      <w:bookmarkStart w:id="11" w:name="_e8304fa6d9a9b4525d84cb9a380d08ea0ddd9c6"/>
       <w:r>
         <w:t xml:space="preserve">SECOND CAUSE OF ACTION AGAINST ALL DEFENDANTS</w:t>
       </w:r>
-      <w:bookmarkEnd w:id="11"/>
     </w:p>
     <w:p>
       <w:pPr>
@@ -775,7 +974,7 @@
         <w:tab/>
       </w:r>
       <w:r>
-        <w:t xml:space="preserve">The accounting which defendant Abraham Roth used to render his decision/award was false and was based on falsified and</w:t>
+        <w:t xml:space="preserve">The accounting which defendant Abraham Roth used to render his decision/​award was false and was based on falsified and</w:t>
       </w:r>
       <w:r>
         <w:t xml:space="preserve"> </w:t>
@@ -927,7 +1126,7 @@
         <w:tab/>
       </w:r>
       <w:r>
-        <w:t xml:space="preserve">Nevertheless, he used those falsified records as the basis for his decision/award.</w:t>
+        <w:t xml:space="preserve">Nevertheless, he used those falsified records as the basis for his decision/​award.</w:t>
       </w:r>
     </w:p>
     <w:p>
@@ -969,7 +1168,7 @@
         <w:tab/>
       </w:r>
       <w:r>
-        <w:t xml:space="preserve">Specifically, on August 24, 2025 Rosenbaum, the lead accountant at Roth &amp; Co. for all fourteen Companies, confirmed that the accounting for all of the Companies had been consolidated into one; that the assets, liabilities, distributions and loans of the individual Companies, including the Debtor, were not analyzed at the company level; and that everything had been treated as one pool belonging to Landau and Schaya personally.</w:t>
+        <w:t xml:space="preserve">Specifically, on August 24, 2025 Rosenbaum, the lead accountant at Roth &amp; Co. for all fourteen Companies, confirmed that the accounting for all of the Companies had been consolidated into one; that the assets, liabilities, distributions and loans of the individual Companies, including the Debtor, were not analyzed at the company level; and that everything had been treated as one pool belonging to Landau and Schaya personally.</w:t>
       </w:r>
     </w:p>
     <w:p>
@@ -1088,11 +1287,9 @@
       <w:pPr>
         <w:pStyle w:val="Heading1"/>
       </w:pPr>
-      <w:bookmarkStart w:id="12" w:name="_4228bb3e0b8400f49aede0cf96b120c592d9765"/>
-      <w:r>
-        <w:t xml:space="preserve">THIRD CAUSE OF ACTION AGAINST DEFENDANT ROTH &amp; COMPANY, SHULEM ROSENBAUM a/k/a SHULIM ROSENBAUM and DOVY GARTENHAUS</w:t>
-      </w:r>
-      <w:bookmarkEnd w:id="12"/>
+      <w:r>
+        <w:t xml:space="preserve">THIRD CAUSE OF ACTION AGAINST DEFENDANT ROTH &amp; COMPANY, SHULEM ROSENBAUM a/​k/​a SHULIM ROSENBAUM and DOVY GARTENHAUS</w:t>
+      </w:r>
     </w:p>
     <w:p>
       <w:pPr>
@@ -1196,11 +1393,9 @@
       <w:pPr>
         <w:pStyle w:val="Heading1"/>
       </w:pPr>
-      <w:bookmarkStart w:id="13" w:name="_1aef1297c80732856db1dde6f49f769ab640bbe"/>
-      <w:r>
-        <w:t xml:space="preserve">FOURTH CAUSE OF ACTION AGAINST DEFENDANT ROTH &amp; COMPANY, SHULEM ROSENBAUM a/k/a SHULIM ROSENBAUM and DOVY GARTENHAUS</w:t>
-      </w:r>
-      <w:bookmarkEnd w:id="13"/>
+      <w:r>
+        <w:t xml:space="preserve">FOURTH CAUSE OF ACTION AGAINST DEFENDANT ROTH &amp; COMPANY, SHULEM ROSENBAUM a/​k/​a SHULIM ROSENBAUM and DOVY GARTENHAUS</w:t>
+      </w:r>
     </w:p>
     <w:p>
       <w:pPr>
@@ -1255,7 +1450,7 @@
         <w:tab/>
       </w:r>
       <w:r>
-        <w:t xml:space="preserve">They breached their fiduciary duty by presenting false information to defendant Abraham Roth and/or presented an</w:t>
+        <w:t xml:space="preserve">They breached their fiduciary duty by presenting false information to defendant Abraham Roth and/​or presented an</w:t>
       </w:r>
       <w:r>
         <w:t xml:space="preserve"> </w:t>
@@ -1274,11 +1469,9 @@
       <w:pPr>
         <w:pStyle w:val="Heading1"/>
       </w:pPr>
-      <w:bookmarkStart w:id="14" w:name="_7059003a87142f5350d133ec7c6073dc1a517d1"/>
       <w:r>
         <w:t xml:space="preserve">FIFTH CAUSE OF ACTION AGAINST DEFENDANT LEAH LIEBER</w:t>
       </w:r>
-      <w:bookmarkEnd w:id="14"/>
     </w:p>
     <w:p>
       <w:pPr>
@@ -1310,12 +1503,7 @@
     </w:p>
     <w:p>
       <w:pPr>
-        <w:pStyle w:val="Spacer"/>
-      </w:pPr>
-    </w:p>
-    <w:p>
-      <w:pPr>
-        <w:pStyle w:val="Lead"/>
+        <w:pStyle w:val="BodyTextKeep"/>
       </w:pPr>
       <w:r>
         <w:t xml:space="preserve">WHEREFORE, plaintiff demands judgment:</w:t>
@@ -1323,7 +1511,7 @@
     </w:p>
     <w:p>
       <w:pPr>
-        <w:pStyle w:val="Prayer"/>
+        <w:pStyle w:val="Allegation"/>
       </w:pPr>
       <w:r>
         <w:t xml:space="preserve">(a)</w:t>
@@ -1337,7 +1525,7 @@
     </w:p>
     <w:p>
       <w:pPr>
-        <w:pStyle w:val="Prayer"/>
+        <w:pStyle w:val="Allegation"/>
       </w:pPr>
       <w:r>
         <w:t xml:space="preserve">(b)</w:t>
@@ -1351,7 +1539,7 @@
     </w:p>
     <w:p>
       <w:pPr>
-        <w:pStyle w:val="Prayer"/>
+        <w:pStyle w:val="Allegation"/>
       </w:pPr>
       <w:r>
         <w:t xml:space="preserve">(c)</w:t>
@@ -1365,7 +1553,7 @@
     </w:p>
     <w:p>
       <w:pPr>
-        <w:pStyle w:val="Prayer"/>
+        <w:pStyle w:val="Allegation"/>
       </w:pPr>
       <w:r>
         <w:t xml:space="preserve">(d)</w:t>
@@ -1379,7 +1567,7 @@
     </w:p>
     <w:p>
       <w:pPr>
-        <w:pStyle w:val="PrayerKeep"/>
+        <w:pStyle w:val="AllegationKeep"/>
       </w:pPr>
       <w:r>
         <w:t xml:space="preserve">(e)</w:t>
@@ -1393,139 +1581,173 @@
     </w:p>
     <w:p>
       <w:pPr>
-        <w:pStyle w:val="Spacer"/>
-      </w:pPr>
-    </w:p>
-    <w:tbl>
-      <w:tblPr>
-        <w:tblW w:w="9360" w:type="dxa"/>
-        <w:tblInd w:w="0" w:type="dxa"/>
-        <w:tblBorders>
-          <w:top w:val="nil"/>
-          <w:left w:val="nil"/>
-          <w:bottom w:val="nil"/>
-          <w:right w:val="nil"/>
-          <w:insideH w:val="nil"/>
-          <w:insideV w:val="nil"/>
-        </w:tblBorders>
-        <w:tblLayout w:type="fixed"/>
-        <w:tblCellMar>
-          <w:left w:w="0" w:type="dxa"/>
-          <w:right w:w="0" w:type="dxa"/>
-        </w:tblCellMar>
-        <w:tblLook w:val="0000" w:firstRow="0" w:lastRow="0" w:firstColumn="0" w:lastColumn="0" w:noHBand="1" w:noVBand="1"/>
-      </w:tblPr>
-      <w:tblGrid>
-        <w:gridCol w:w="4680"/>
-        <w:gridCol w:w="4680"/>
-      </w:tblGrid>
-      <w:tr>
-        <w:trPr>
-          <w:cantSplit/>
-        </w:trPr>
-        <w:tc>
-          <w:tcPr>
-            <w:tcW w:w="4680" w:type="dxa"/>
-            <w:tcMar>
-              <w:top w:w="0" w:type="dxa"/>
-              <w:left w:w="0" w:type="dxa"/>
-              <w:bottom w:w="160" w:type="dxa"/>
-              <w:right w:w="0" w:type="dxa"/>
-            </w:tcMar>
-            <w:vAlign w:val="top"/>
-          </w:tcPr>
-          <w:p>
-            <w:pPr>
-              <w:pStyle w:val="SingleKeep"/>
-            </w:pPr>
-            <w:r>
-              <w:t xml:space="preserve">Dated: September 19, 2026</w:t>
-            </w:r>
-          </w:p>
-        </w:tc>
-        <w:tc>
-          <w:tcPr>
-            <w:tcW w:w="4680" w:type="dxa"/>
-            <w:tcMar>
-              <w:top w:w="0" w:type="dxa"/>
-              <w:left w:w="0" w:type="dxa"/>
-              <w:bottom w:w="160" w:type="dxa"/>
-              <w:right w:w="0" w:type="dxa"/>
-            </w:tcMar>
-            <w:vAlign w:val="top"/>
-          </w:tcPr>
-          <w:p>
-            <w:pPr>
-              <w:pStyle w:val="SingleKeep"/>
-            </w:pPr>
-            <w:r>
-              <w:t xml:space="preserve">/s/ Solomon Rosengarten</w:t>
-            </w:r>
-          </w:p>
-          <w:p>
-            <w:pPr>
-              <w:pStyle w:val="SingleKeep"/>
-            </w:pPr>
-            <w:r>
-              <w:t xml:space="preserve">_________________________</w:t>
-            </w:r>
-          </w:p>
-          <w:p>
-            <w:pPr>
-              <w:pStyle w:val="SingleKeep"/>
-            </w:pPr>
-            <w:r>
-              <w:t xml:space="preserve">SOLOMON ROSENGARTEN</w:t>
-            </w:r>
-          </w:p>
-          <w:p>
-            <w:pPr>
-              <w:pStyle w:val="SingleKeep"/>
-            </w:pPr>
-            <w:r>
-              <w:t xml:space="preserve">Attorney for Plaintiff</w:t>
-            </w:r>
-          </w:p>
-          <w:p>
-            <w:pPr>
-              <w:pStyle w:val="SingleKeep"/>
-            </w:pPr>
-            <w:r>
-              <w:t xml:space="preserve">2329 Nostrand Avenue</w:t>
-            </w:r>
-          </w:p>
-          <w:p>
-            <w:pPr>
-              <w:pStyle w:val="SingleKeep"/>
-            </w:pPr>
-            <w:r>
-              <w:t xml:space="preserve">Brooklyn, New York 11210</w:t>
-            </w:r>
-          </w:p>
-          <w:p>
-            <w:pPr>
-              <w:pStyle w:val="SingleKeep"/>
-            </w:pPr>
-            <w:r>
-              <w:t xml:space="preserve">718-627-4460</w:t>
-            </w:r>
-          </w:p>
-          <w:p>
-            <w:pPr>
-              <w:pStyle w:val="Single"/>
-            </w:pPr>
-            <w:r>
-              <w:t xml:space="preserve">vokma@aol.com</w:t>
-            </w:r>
-          </w:p>
-        </w:tc>
-      </w:tr>
-    </w:tbl>
+        <w:keepNext/>
+        <w:keepLines/>
+        <w:tabs>
+          <w:tab w:val="left" w:pos="4680"/>
+        </w:tabs>
+        <w:spacing w:before="480" w:after="0" w:line="276" w:lineRule="exact"/>
+        <w:ind w:left="4680" w:hanging="4680"/>
+        <w:jc w:val="left"/>
+      </w:pPr>
+      <w:r>
+        <w:t xml:space="preserve">Dated: September 19, 2026</w:t>
+      </w:r>
+      <w:r>
+        <w:tab/>
+      </w:r>
+      <w:r>
+        <w:t xml:space="preserve">/​s/</w:t>
+      </w:r>
+      <w:r>
+        <w:t xml:space="preserve"> </w:t>
+      </w:r>
+      <w:r>
+        <w:t xml:space="preserve">Solomon</w:t>
+      </w:r>
+      <w:r>
+        <w:t xml:space="preserve"> </w:t>
+      </w:r>
+      <w:r>
+        <w:t xml:space="preserve">Rosengarten</w:t>
+      </w:r>
+    </w:p>
+    <w:p>
+      <w:pPr>
+        <w:keepNext/>
+        <w:keepLines/>
+        <w:spacing w:before="0" w:after="0" w:line="276" w:lineRule="exact"/>
+        <w:ind w:left="4680" w:firstLine="0"/>
+        <w:jc w:val="left"/>
+      </w:pPr>
+      <w:r>
+        <w:t xml:space="preserve">_________________________</w:t>
+      </w:r>
+    </w:p>
+    <w:p>
+      <w:pPr>
+        <w:keepNext/>
+        <w:keepLines/>
+        <w:spacing w:before="0" w:after="0" w:line="276" w:lineRule="exact"/>
+        <w:ind w:left="4680" w:firstLine="0"/>
+        <w:jc w:val="left"/>
+      </w:pPr>
+      <w:r>
+        <w:t xml:space="preserve">SOLOMON</w:t>
+      </w:r>
+      <w:r>
+        <w:t xml:space="preserve"> </w:t>
+      </w:r>
+      <w:r>
+        <w:t xml:space="preserve">ROSENGARTEN</w:t>
+      </w:r>
+    </w:p>
+    <w:p>
+      <w:pPr>
+        <w:keepNext/>
+        <w:keepLines/>
+        <w:spacing w:before="0" w:after="0" w:line="276" w:lineRule="exact"/>
+        <w:ind w:left="4680" w:firstLine="0"/>
+        <w:jc w:val="left"/>
+      </w:pPr>
+      <w:r>
+        <w:t xml:space="preserve">Attorney</w:t>
+      </w:r>
+      <w:r>
+        <w:t xml:space="preserve"> </w:t>
+      </w:r>
+      <w:r>
+        <w:t xml:space="preserve">for</w:t>
+      </w:r>
+      <w:r>
+        <w:t xml:space="preserve"> </w:t>
+      </w:r>
+      <w:r>
+        <w:t xml:space="preserve">Plaintiff</w:t>
+      </w:r>
+    </w:p>
+    <w:p>
+      <w:pPr>
+        <w:keepNext/>
+        <w:keepLines/>
+        <w:spacing w:before="0" w:after="0" w:line="276" w:lineRule="exact"/>
+        <w:ind w:left="4680" w:firstLine="0"/>
+        <w:jc w:val="left"/>
+      </w:pPr>
+      <w:r>
+        <w:t xml:space="preserve">2329</w:t>
+      </w:r>
+      <w:r>
+        <w:t xml:space="preserve"> </w:t>
+      </w:r>
+      <w:r>
+        <w:t xml:space="preserve">Nostrand</w:t>
+      </w:r>
+      <w:r>
+        <w:t xml:space="preserve"> </w:t>
+      </w:r>
+      <w:r>
+        <w:t xml:space="preserve">Avenue</w:t>
+      </w:r>
+    </w:p>
+    <w:p>
+      <w:pPr>
+        <w:keepNext/>
+        <w:keepLines/>
+        <w:spacing w:before="0" w:after="0" w:line="276" w:lineRule="exact"/>
+        <w:ind w:left="4680" w:firstLine="0"/>
+        <w:jc w:val="left"/>
+      </w:pPr>
+      <w:r>
+        <w:t xml:space="preserve">Brooklyn,</w:t>
+      </w:r>
+      <w:r>
+        <w:t xml:space="preserve"> </w:t>
+      </w:r>
+      <w:r>
+        <w:t xml:space="preserve">New</w:t>
+      </w:r>
+      <w:r>
+        <w:t xml:space="preserve"> </w:t>
+      </w:r>
+      <w:r>
+        <w:t xml:space="preserve">York</w:t>
+      </w:r>
+      <w:r>
+        <w:t xml:space="preserve"> </w:t>
+      </w:r>
+      <w:r>
+        <w:t xml:space="preserve">11210</w:t>
+      </w:r>
+    </w:p>
+    <w:p>
+      <w:pPr>
+        <w:keepNext/>
+        <w:keepLines/>
+        <w:spacing w:before="0" w:after="0" w:line="276" w:lineRule="exact"/>
+        <w:ind w:left="4680" w:firstLine="0"/>
+        <w:jc w:val="left"/>
+      </w:pPr>
+      <w:r>
+        <w:t xml:space="preserve">718</w:t>
+        <w:noBreakHyphen/>
+        <w:t xml:space="preserve">627</w:t>
+        <w:noBreakHyphen/>
+        <w:t xml:space="preserve">4460</w:t>
+      </w:r>
+    </w:p>
+    <w:p>
+      <w:pPr>
+        <w:spacing w:before="0" w:after="0" w:line="276" w:lineRule="exact"/>
+        <w:ind w:left="4680" w:firstLine="0"/>
+        <w:jc w:val="left"/>
+      </w:pPr>
+      <w:r>
+        <w:t xml:space="preserve">vokma@aol.com</w:t>
+      </w:r>
+    </w:p>
     <w:sectPr>
       <w:footerReference w:type="default" r:id="rIdFooter1"/>
-      <w:footnotePr>
-        <w:numRestart w:val="eachSect"/>
-      </w:footnotePr>
       <w:pgSz w:w="12240" w:h="15840"/>
       <w:pgMar w:top="1440" w:right="1440" w:bottom="1440" w:left="1440" w:header="720" w:footer="720" w:gutter="0"/>
     </w:sectPr>
@@ -1541,7 +1763,7 @@
 <w:ftr xmlns:w="http://schemas.openxmlformats.org/wordprocessingml/2006/main" xmlns:r="http://schemas.openxmlformats.org/officeDocument/2006/relationships">
   <w:p>
     <w:pPr>
-      <w:spacing w:before="0" w:after="0" w:line="240" w:lineRule="auto"/>
+      <w:spacing w:before="0" w:after="0" w:line="276" w:lineRule="exact"/>
       <w:ind w:firstLine="0"/>
       <w:jc w:val="center"/>
     </w:pPr>
@@ -1672,7 +1894,7 @@
   <w:docDefaults>
     <w:rPrDefault>
       <w:rPr>
-        <w:rFonts w:ascii="EB Garamond" w:hAnsi="EB Garamond" w:eastAsia="EB Garamond" w:cs="EB Garamond"/>
+        <w:rFonts w:ascii="Times New Roman" w:hAnsi="Times New Roman" w:eastAsia="Times New Roman" w:cs="Times New Roman"/>
         <w:sz w:val="24"/>
         <w:szCs w:val="24"/>
         <w:lang w:val="en-US" w:eastAsia="zh-CN" w:bidi="ar-SA"/>
@@ -1681,11 +1903,39 @@
     <w:pPrDefault>
       <w:pPr>
         <w:widowControl/>
-        <w:spacing w:before="0" w:after="0" w:line="240" w:lineRule="auto"/>
+        <w:spacing w:after="0"/>
       </w:pPr>
     </w:pPrDefault>
   </w:docDefaults>
   <w:latentStyles w:defLockedState="0" w:defUIPriority="0" w:defSemiHidden="0" w:defUnhideWhenUsed="0" w:defQFormat="0" w:count="276"/>
+  <w:style w:type="paragraph" w:default="1" w:styleId="Normal">
+    <w:name w:val="Normal"/>
+    <w:qFormat/>
+  </w:style>
+  <w:style w:type="paragraph" w:styleId="BodyText">
+    <w:name w:val="Body Text"/>
+    <w:basedOn w:val="Normal"/>
+    <w:link w:val="BodyTextChar"/>
+    <w:qFormat/>
+    <w:pPr>
+      <w:spacing w:before="0" w:after="0" w:line="480" w:lineRule="exact"/>
+      <w:ind w:firstLine="720"/>
+    </w:pPr>
+  </w:style>
+  <w:style w:type="paragraph" w:customStyle="1" w:styleId="FirstParagraph">
+    <w:name w:val="First Paragraph"/>
+    <w:basedOn w:val="BodyText"/>
+    <w:next w:val="BodyText"/>
+    <w:qFormat/>
+  </w:style>
+  <w:style w:type="paragraph" w:customStyle="1" w:styleId="Compact">
+    <w:name w:val="Compact"/>
+    <w:basedOn w:val="BodyText"/>
+    <w:qFormat/>
+    <w:pPr>
+      <w:spacing w:before="36" w:after="36"/>
+    </w:pPr>
+  </w:style>
   <w:style w:type="paragraph" w:styleId="Title">
     <w:name w:val="Title"/>
     <w:basedOn w:val="Normal"/>
@@ -1819,6 +2069,71 @@
     <w:pPr/>
     <w:rPr/>
   </w:style>
+  <w:style w:type="paragraph" w:styleId="Heading1">
+    <w:name w:val="heading 1"/>
+    <w:basedOn w:val="Normal"/>
+    <w:next w:val="Allegation"/>
+    <w:qFormat/>
+    <w:pPr>
+      <w:keepNext/>
+      <w:keepLines/>
+      <w:spacing w:before="240" w:after="0" w:line="480" w:lineRule="exact"/>
+      <w:ind w:firstLine="0"/>
+      <w:jc w:val="center"/>
+      <w:outlineLvl w:val="0"/>
+    </w:pPr>
+    <w:rPr>
+      <w:b/>
+      <w:bCs/>
+      <w:color w:val="000000"/>
+      <w:sz w:val="24"/>
+      <w:szCs w:val="24"/>
+    </w:rPr>
+  </w:style>
+  <w:style w:type="paragraph" w:styleId="Heading2">
+    <w:name w:val="heading 2"/>
+    <w:basedOn w:val="Normal"/>
+    <w:next w:val="Allegation"/>
+    <w:qFormat/>
+    <w:pPr>
+      <w:keepNext/>
+      <w:keepLines/>
+      <w:spacing w:before="240" w:after="0" w:line="480" w:lineRule="exact"/>
+      <w:ind w:firstLine="0"/>
+      <w:jc w:val="center"/>
+      <w:outlineLvl w:val="1"/>
+    </w:pPr>
+    <w:rPr>
+      <w:b/>
+      <w:bCs/>
+      <w:color w:val="000000"/>
+      <w:sz w:val="24"/>
+      <w:szCs w:val="24"/>
+    </w:rPr>
+  </w:style>
+  <w:style w:type="paragraph" w:styleId="Heading3">
+    <w:name w:val="heading 3"/>
+    <w:basedOn w:val="Normal"/>
+    <w:next w:val="Allegation"/>
+    <w:qFormat/>
+    <w:pPr>
+      <w:keepNext/>
+      <w:keepLines/>
+      <w:spacing w:before="240" w:after="0" w:line="480" w:lineRule="exact"/>
+      <w:ind w:firstLine="0"/>
+      <w:jc w:val="left"/>
+      <w:outlineLvl w:val="2"/>
+    </w:pPr>
+    <w:rPr>
+      <w:b/>
+      <w:bCs/>
+      <w:i/>
+      <w:iCs/>
+      <w:color w:val="000000"/>
+      <w:sz w:val="24"/>
+      <w:szCs w:val="24"/>
+    </w:rPr>
+  </w:style>
   <w:style w:type="paragraph" w:styleId="Heading4">
     <w:name w:val="heading 4"/>
     <w:basedOn w:val="Normal"/>
@@ -1832,14 +2147,18 @@
     <w:pPr>
       <w:keepNext/>
       <w:keepLines/>
-      <w:spacing w:before="80" w:after="40"/>
+      <w:spacing w:before="240" w:after="120" w:line="276" w:lineRule="exact"/>
+      <w:ind w:firstLine="0"/>
       <w:outlineLvl w:val="3"/>
     </w:pPr>
     <w:rPr>
-      <w:rFonts w:eastAsiaTheme="majorEastAsia" w:cstheme="majorBidi"/>
+      <w:rFonts w:ascii="Times New Roman" w:hAnsi="Times New Roman" w:eastAsia="Times New Roman" w:cs="Times New Roman"/>
+      <w:b/>
+      <w:bCs/>
       <w:i/>
-      <w:iCs/>
-      <w:color w:val="0F4761" w:themeColor="accent1" w:themeShade="BF"/>
+      <w:color w:val="000000"/>
+      <w:sz w:val="24"/>
+      <w:szCs w:val="24"/>
     </w:rPr>
   </w:style>
   <w:style w:type="paragraph" w:styleId="Heading5">
@@ -1855,12 +2174,18 @@
     <w:pPr>
       <w:keepNext/>
       <w:keepLines/>
-      <w:spacing w:before="80" w:after="40"/>
+      <w:spacing w:before="240" w:after="120" w:line="276" w:lineRule="exact"/>
+      <w:ind w:firstLine="0"/>
       <w:outlineLvl w:val="4"/>
     </w:pPr>
     <w:rPr>
-      <w:rFonts w:eastAsiaTheme="majorEastAsia" w:cstheme="majorBidi"/>
-      <w:color w:val="0F4761" w:themeColor="accent1" w:themeShade="BF"/>
+      <w:rFonts w:ascii="Times New Roman" w:hAnsi="Times New Roman" w:eastAsia="Times New Roman" w:cs="Times New Roman"/>
+      <w:b/>
+      <w:bCs/>
+      <w:i/>
+      <w:color w:val="000000"/>
+      <w:sz w:val="24"/>
+      <w:szCs w:val="24"/>
     </w:rPr>
   </w:style>
   <w:style w:type="paragraph" w:styleId="Heading6">
@@ -2070,6 +2395,43 @@
       <w:color w:val="272727" w:themeColor="text1" w:themeTint="D8"/>
     </w:rPr>
   </w:style>
+  <w:style w:type="paragraph" w:customStyle="1" w:styleId="ListItem">
+    <w:name w:val="List Item"/>
+    <w:basedOn w:val="BodyText"/>
+    <w:qFormat/>
+    <w:pPr>
+      <w:spacing w:before="0" w:after="0" w:line="480" w:lineRule="exact"/>
+      <w:ind w:left="720" w:hanging="720"/>
+    </w:pPr>
+  </w:style>
+  <w:style w:type="paragraph" w:styleId="BlockText">
+    <w:name w:val="Block Text"/>
+    <w:basedOn w:val="BodyText"/>
+    <w:next w:val="BodyText"/>
+    <w:uiPriority w:val="9"/>
+    <w:unhideWhenUsed/>
+    <w:qFormat/>
+    <w:pPr>
+      <w:spacing w:before="280" w:after="280" w:line="276" w:lineRule="exact"/>
+      <w:ind w:firstLine="0" w:left="720" w:right="720"/>
+    </w:pPr>
+  </w:style>
+  <w:style w:type="paragraph" w:styleId="FootnoteText">
+    <w:name w:val="Footnote Text"/>
+    <w:basedOn w:val="Normal"/>
+    <w:next w:val="FootnoteText"/>
+    <w:uiPriority w:val="9"/>
+    <w:unhideWhenUsed/>
+    <w:qFormat/>
+    <w:pPr>
+      <w:keepLines/>
+      <w:spacing w:before="0" w:after="140" w:line="276" w:lineRule="exact"/>
+    </w:pPr>
+    <w:rPr>
+      <w:sz w:val="24"/>
+      <w:szCs w:val="24"/>
+    </w:rPr>
+  </w:style>
   <w:style w:type="paragraph" w:styleId="FootnoteBlockText">
     <w:name w:val="Footnote Block Text"/>
     <w:basedOn w:val="FootnoteText"/>
@@ -2078,8 +2440,8 @@
     <w:unhideWhenUsed/>
     <w:qFormat/>
     <w:pPr>
-      <w:spacing w:before="100" w:after="100"/>
-      <w:ind w:firstLine="0" w:left="480" w:right="480"/>
+      <w:spacing w:before="280" w:after="280"/>
+      <w:ind w:firstLine="0" w:left="720" w:right="720"/>
     </w:pPr>
   </w:style>
   <w:style w:type="character" w:default="1" w:styleId="DefaultParagraphFont">
@@ -2187,7 +2549,7 @@
     <w:name w:val="Hyperlink"/>
     <w:basedOn w:val="BodyTextChar"/>
     <w:rPr>
-      <w:color w:val="4F81BD" w:themeColor="accent1"/>
+      <w:color w:val="000000"/>
     </w:rPr>
   </w:style>
   <w:style w:type="paragraph" w:styleId="TOCHeading">
@@ -2208,167 +2570,9 @@
       <w:color w:val="365F91" w:themeColor="accent1" w:themeShade="BF"/>
     </w:rPr>
   </w:style>
-  <w:style w:type="paragraph" w:default="1" w:styleId="Normal">
-    <w:name w:val="Normal"/>
-    <w:qFormat/>
-    <w:pPr>
-      <w:widowControl/>
-      <w:spacing w:before="0" w:after="0" w:line="240" w:lineRule="auto"/>
-      <w:ind w:firstLine="0"/>
-    </w:pPr>
-  </w:style>
-  <w:style w:type="paragraph" w:styleId="BodyText">
-    <w:name w:val="Body Text"/>
-    <w:basedOn w:val="Normal"/>
-    <w:qFormat/>
-    <w:pPr>
-      <w:spacing w:before="0" w:after="0" w:line="480" w:lineRule="exact"/>
-      <w:ind w:firstLine="720"/>
-    </w:pPr>
-  </w:style>
-  <w:style w:type="paragraph" w:styleId="FirstParagraph">
-    <w:name w:val="First Paragraph"/>
+  <w:style w:type="paragraph" w:customStyle="1" w:styleId="BodyTextKeep">
+    <w:name w:val="Body Text Keep"/>
     <w:basedOn w:val="BodyText"/>
-    <w:next w:val="BodyText"/>
-    <w:qFormat/>
-  </w:style>
-  <w:style w:type="paragraph" w:styleId="Compact">
-    <w:name w:val="Compact"/>
-    <w:basedOn w:val="BodyText"/>
-    <w:qFormat/>
-    <w:pPr>
-      <w:ind w:firstLine="0"/>
-    </w:pPr>
-  </w:style>
-  <w:style w:type="paragraph" w:styleId="BlockText">
-    <w:name w:val="Block Text"/>
-    <w:basedOn w:val="Normal"/>
-    <w:next w:val="BodyText"/>
-    <w:qFormat/>
-    <w:pPr>
-      <w:spacing w:before="0" w:after="320" w:line="276" w:lineRule="exact"/>
-      <w:ind w:left="1440" w:right="1440" w:firstLine="0"/>
-    </w:pPr>
-  </w:style>
-  <w:style w:type="paragraph" w:styleId="Heading1">
-    <w:name w:val="heading 1"/>
-    <w:basedOn w:val="Normal"/>
-    <w:next w:val="FirstParagraph"/>
-    <w:qFormat/>
-    <w:pPr>
-      <w:keepNext/>
-      <w:keepLines/>
-      <w:spacing w:before="160" w:after="0" w:line="480" w:lineRule="exact"/>
-      <w:ind w:firstLine="0"/>
-      <w:jc w:val="center"/>
-      <w:outlineLvl w:val="0"/>
-    </w:pPr>
-    <w:rPr>
-      <w:b/>
-      <w:bCs/>
-    </w:rPr>
-  </w:style>
-  <w:style w:type="paragraph" w:styleId="Heading2">
-    <w:name w:val="heading 2"/>
-    <w:basedOn w:val="Normal"/>
-    <w:next w:val="FirstParagraph"/>
-    <w:qFormat/>
-    <w:pPr>
-      <w:keepNext/>
-      <w:keepLines/>
-      <w:spacing w:before="160" w:after="0" w:line="480" w:lineRule="exact"/>
-      <w:ind w:firstLine="0"/>
-      <w:jc w:val="center"/>
-      <w:outlineLvl w:val="1"/>
-    </w:pPr>
-    <w:rPr>
-      <w:b/>
-      <w:bCs/>
-    </w:rPr>
-  </w:style>
-  <w:style w:type="paragraph" w:styleId="Heading3">
-    <w:name w:val="heading 3"/>
-    <w:basedOn w:val="Normal"/>
-    <w:next w:val="FirstParagraph"/>
-    <w:qFormat/>
-    <w:pPr>
-      <w:keepNext/>
-      <w:keepLines/>
-      <w:spacing w:before="160" w:after="0" w:line="480" w:lineRule="exact"/>
-      <w:ind w:firstLine="0"/>
-      <w:outlineLvl w:val="2"/>
-    </w:pPr>
-    <w:rPr>
-      <w:b/>
-      <w:bCs/>
-      <w:i/>
-      <w:iCs/>
-    </w:rPr>
-  </w:style>
-  <w:style w:type="paragraph" w:styleId="FootnoteText">
-    <w:name w:val="footnote text"/>
-    <w:basedOn w:val="Normal"/>
-    <w:pPr>
-      <w:spacing w:before="0" w:after="60" w:line="240" w:lineRule="auto"/>
-      <w:ind w:firstLine="0"/>
-    </w:pPr>
-    <w:rPr>
-      <w:sz w:val="20"/>
-      <w:szCs w:val="20"/>
-    </w:rPr>
-  </w:style>
-  <w:style w:type="paragraph" w:customStyle="1" w:styleId="Single">
-    <w:name w:val="Single"/>
-    <w:basedOn w:val="Normal"/>
-    <w:qFormat/>
-    <w:pPr>
-      <w:spacing w:before="0" w:after="0" w:line="276" w:lineRule="exact"/>
-      <w:ind w:firstLine="0"/>
-    </w:pPr>
-  </w:style>
-  <w:style w:type="paragraph" w:customStyle="1" w:styleId="SingleKeep">
-    <w:name w:val="Single Keep"/>
-    <w:basedOn w:val="Single"/>
-    <w:qFormat/>
-    <w:pPr>
-      <w:keepNext/>
-      <w:keepLines/>
-    </w:pPr>
-  </w:style>
-  <w:style w:type="paragraph" w:customStyle="1" w:styleId="Centered">
-    <w:name w:val="Centered"/>
-    <w:basedOn w:val="Single"/>
-    <w:qFormat/>
-    <w:pPr>
-      <w:jc w:val="center"/>
-    </w:pPr>
-  </w:style>
-  <w:style w:type="paragraph" w:customStyle="1" w:styleId="Spacer">
-    <w:name w:val="Spacer"/>
-    <w:basedOn w:val="Normal"/>
-    <w:pPr>
-      <w:keepNext/>
-      <w:spacing w:before="0" w:after="0" w:line="480" w:lineRule="exact"/>
-    </w:pPr>
-  </w:style>
-  <w:style w:type="paragraph" w:customStyle="1" w:styleId="Gap6">
-    <w:name w:val="Gap 6 pt"/>
-    <w:basedOn w:val="Normal"/>
-    <w:pPr>
-      <w:spacing w:before="0" w:after="0" w:line="120" w:lineRule="exact"/>
-    </w:pPr>
-  </w:style>
-  <w:style w:type="paragraph" w:customStyle="1" w:styleId="Lead">
-    <w:name w:val="Lead"/>
-    <w:basedOn w:val="BodyText"/>
-    <w:qFormat/>
-    <w:pPr>
-      <w:ind w:left="720" w:firstLine="0"/>
-    </w:pPr>
-  </w:style>
-  <w:style w:type="paragraph" w:customStyle="1" w:styleId="LeadKeep">
-    <w:name w:val="Lead Keep"/>
-    <w:basedOn w:val="Lead"/>
     <w:qFormat/>
     <w:pPr>
       <w:keepNext/>
@@ -2383,6 +2587,7 @@
       <w:tabs>
         <w:tab w:val="left" w:pos="1440"/>
       </w:tabs>
+      <w:spacing w:before="0" w:after="0" w:line="480" w:lineRule="exact"/>
       <w:ind w:left="1440" w:hanging="720"/>
     </w:pPr>
   </w:style>
@@ -2394,25 +2599,6 @@
       <w:keepNext/>
       <w:keepLines/>
     </w:pPr>
-  </w:style>
-  <w:style w:type="paragraph" w:customStyle="1" w:styleId="Prayer">
-    <w:name w:val="Prayer"/>
-    <w:basedOn w:val="Allegation"/>
-    <w:qFormat/>
-  </w:style>
-  <w:style w:type="paragraph" w:customStyle="1" w:styleId="PrayerKeep">
-    <w:name w:val="Prayer Keep"/>
-    <w:basedOn w:val="Prayer"/>
-    <w:qFormat/>
-    <w:pPr>
-      <w:keepNext/>
-      <w:keepLines/>
-    </w:pPr>
-  </w:style>
-  <w:style w:type="paragraph" w:customStyle="1" w:styleId="PrayerKeep">
-    <w:name w:val="PrayerKeep"/>
-    <w:basedOn w:val="BodyText"/>
-    <w:qFormat/>
   </w:style>
   <w:style w:type="paragraph" w:customStyle="1" w:styleId="SourceCode">
     <w:name w:val="Source Code"/>

</xml_diff>